<commit_message>
feat: default products grid view to 4x3 matrix across all pages
</commit_message>
<xml_diff>
--- a/resources/BoCongThuong/03_De_an_Mau_05_Tat_Tan_Tat_HOAN_THIEN.docx
+++ b/resources/BoCongThuong/03_De_an_Mau_05_Tat_Tan_Tat_HOAN_THIEN.docx
@@ -105,37 +105,7 @@
               <w:rPr>
                 <w:sz w:val="24"/>
               </w:rPr>
-              <w:t>Gia Lai</w:t>
-            </w:r>
-            <w:r>
-              <w:rPr>
-                <w:sz w:val="24"/>
-              </w:rPr>
-              <w:t xml:space="preserve">, ngày </w:t>
-            </w:r>
-            <w:r>
-              <w:rPr>
-                <w:sz w:val="24"/>
-              </w:rPr>
-              <w:t>23</w:t>
-            </w:r>
-            <w:r>
-              <w:rPr>
-                <w:sz w:val="24"/>
-              </w:rPr>
-              <w:t xml:space="preserve"> tháng </w:t>
-            </w:r>
-            <w:r>
-              <w:rPr>
-                <w:sz w:val="24"/>
-              </w:rPr>
-              <w:t>09</w:t>
-            </w:r>
-            <w:r>
-              <w:rPr>
-                <w:sz w:val="24"/>
-              </w:rPr>
-              <w:t xml:space="preserve"> năm 2026</w:t>
+              <w:t>Gia Lai, ngày 23 tháng 09 năm 2026</w:t>
             </w:r>
           </w:p>
         </w:tc>
@@ -801,11 +771,7 @@
         <w:ind w:firstLine="425"/>
       </w:pPr>
       <w:r>
-        <w:t xml:space="preserve">Đăng ký/đăng nhập → xác minh thông tin theo mức độ yêu cầu → chọn danh mục → nhập nội dung, giá, khu vực, hình ảnh và thông tin bắt buộc → gửi duyệt → hệ thống/nhân </w:t>
-      </w:r>
-      <w:r>
-        <w:lastRenderedPageBreak/>
-        <w:t>sự kiểm duyệt → tin được công khai hoặc yêu cầu chỉnh sửa/từ chối → người bán quản lý, cập nhật, ẩn hoặc kết thúc tin.</w:t>
+        <w:t>Đăng ký/đăng nhập → xác minh thông tin theo mức độ yêu cầu → chọn danh mục → nhập nội dung, giá, khu vực, hình ảnh và thông tin bắt buộc → gửi duyệt → hệ thống/nhân sự kiểm duyệt → tin được công khai hoặc yêu cầu chỉnh sửa/từ chối → người bán quản lý, cập nhật, ẩn hoặc kết thúc tin.</w:t>
       </w:r>
     </w:p>
     <w:p>
@@ -813,6 +779,7 @@
         <w:pStyle w:val="Heading3"/>
       </w:pPr>
       <w:r>
+        <w:lastRenderedPageBreak/>
         <w:t>2.6. Kiểm duyệt và kiểm soát thông tin</w:t>
       </w:r>
     </w:p>
@@ -928,7 +895,6 @@
         <w:pStyle w:val="Heading2"/>
       </w:pPr>
       <w:r>
-        <w:lastRenderedPageBreak/>
         <w:t>4. Nguồn thu và cơ chế thu phí</w:t>
       </w:r>
     </w:p>
@@ -960,6 +926,7 @@
         <w:pStyle w:val="Heading1"/>
       </w:pPr>
       <w:r>
+        <w:lastRenderedPageBreak/>
         <w:t>III. QUY CHẾ HOẠT ĐỘNG</w:t>
       </w:r>
     </w:p>
@@ -1087,12 +1054,6 @@
                 <w:sz w:val="24"/>
               </w:rPr>
               <w:br/>
-            </w:r>
-            <w:r>
-              <w:rPr>
-                <w:sz w:val="24"/>
-              </w:rPr>
-              <w:lastRenderedPageBreak/>
               <w:t>- Bộ Công Thương;</w:t>
             </w:r>
             <w:r>
@@ -1118,16 +1079,7 @@
                 <w:b/>
                 <w:sz w:val="24"/>
               </w:rPr>
-              <w:lastRenderedPageBreak/>
-              <w:t xml:space="preserve">NGƯỜI CHỊU TRÁCH NHIỆM TRƯỚC </w:t>
-            </w:r>
-            <w:r>
-              <w:rPr>
-                <w:b/>
-                <w:sz w:val="24"/>
-              </w:rPr>
-              <w:lastRenderedPageBreak/>
-              <w:t>PHÁP LUẬT/</w:t>
+              <w:t>NGƯỜI CHỊU TRÁCH NHIỆM TRƯỚC PHÁP LUẬT/</w:t>
             </w:r>
             <w:r>
               <w:rPr>
@@ -1152,7 +1104,7 @@
     <w:p/>
     <w:sectPr>
       <w:pgSz w:w="12240" w:h="15840"/>
-      <w:pgMar w:top="851" w:right="1134" w:bottom="1134" w:left="1417" w:header="720" w:footer="720" w:gutter="0"/>
+      <w:pgMar w:top="851" w:right="1134" w:bottom="284" w:left="1417" w:header="720" w:footer="720" w:gutter="0"/>
       <w:cols w:space="720"/>
       <w:docGrid w:linePitch="360"/>
     </w:sectPr>

</xml_diff>